<commit_message>
Verified refs + DOIs; v4.1.0 DOI; deeper calibration (env->SI 0.60, bgi circularity flagged); AmeriFlux figure; manuscript figures/journal
</commit_message>
<xml_diff>
--- a/rs-cspi/paper2/manuscript/RS_CSPI_manuscript_v0_2.docx
+++ b/rs-cspi/paper2/manuscript/RS_CSPI_manuscript_v0_2.docx
@@ -2,7 +2,7 @@
 <file path=word/document.xml><?xml version="1.0" encoding="utf-8"?>
 <w:document xmlns:w="http://schemas.openxmlformats.org/wordprocessingml/2006/main" xmlns:m="http://schemas.openxmlformats.org/officeDocument/2006/math" xmlns:r="http://schemas.openxmlformats.org/officeDocument/2006/relationships" xmlns:o="urn:schemas-microsoft-com:office:office" xmlns:v="urn:schemas-microsoft-com:vml" xmlns:w10="urn:schemas-microsoft-com:office:word" xmlns:a="http://schemas.openxmlformats.org/drawingml/2006/main" xmlns:pic="http://schemas.openxmlformats.org/drawingml/2006/picture" xmlns:wp="http://schemas.openxmlformats.org/drawingml/2006/wordprocessingDrawing">
   <w:body>
-    <w:bookmarkStart w:id="38" w:name="Xdb0287c7969a9974f607fda3ee8d45b77aa5ad0"/>
+    <w:bookmarkStart w:id="39" w:name="Xdb0287c7969a9974f607fda3ee8d45b77aa5ad0"/>
     <w:p>
       <w:pPr>
         <w:pStyle w:val="Heading1"/>
@@ -24,7 +24,7 @@
         <w:pStyle w:val="BodyText"/>
       </w:pPr>
       <w:r>
-        <w:t xml:space="preserve">Target journal: Remote Sensing of Environment or Forest Ecology and Management.</w:t>
+        <w:t xml:space="preserve">Target journal: Remote Sensing of Environment.</w:t>
       </w:r>
     </w:p>
     <w:bookmarkStart w:id="9" w:name="abstract"/>
@@ -336,7 +336,7 @@
         <w:pStyle w:val="FirstParagraph"/>
       </w:pPr>
       <w:r>
-        <w:t xml:space="preserve">The three level targets combine into a coherent 1 km integrated productivity index with a clear continental gradient. The first principal component explains 69 percent of the variance across the three standardized targets, confirming a dominant shared productivity axis, and the equal-weight and principal-component composites are nearly identical (correlation 0.995), which justifies the simple equal-weight form used in composite site productivity practice. Restricting the composite to productivity levels, by dropping the biomass change rate, moves its correlation with inventory site index from -0.39 to -0.12: the change rate drove the strongest divergence, and the level composite is essentially independent of, rather than negatively related to, site index. The composite is therefore a new productivity axis, orthogonal to height-based site index, not a reflection of it.</w:t>
+        <w:t xml:space="preserve">The three level targets combine into a coherent 1 km integrated productivity index with a clear continental gradient. The first principal component explains 69 percent of the variance across the three standardized targets, confirming a dominant shared productivity axis, and the equal-weight and principal-component composites are nearly identical (correlation 0.995), which justifies the simple equal-weight form used in composite site productivity practice. Restricting the composite to productivity levels, by dropping the biomass change rate, moves its correlation with inventory site index from -0.39 to -0.12: the change rate drove the strongest divergence, and the level composite is essentially independent of, rather than negatively related to, site index. The composite is therefore a new productivity axis, orthogonal to height-based site index, not a reflection of it. Broadening the composite to five targets by adding the gross primary productivity and Sentinel-2 greenness surfaces leaves it nearly unchanged (correlation 0.95 with the three-target index), so the parsimonious three-target composite is retained as the primary product.</w:t>
       </w:r>
     </w:p>
     <w:bookmarkEnd w:id="24"/>
@@ -390,7 +390,7 @@
         <w:pStyle w:val="FirstParagraph"/>
       </w:pPr>
       <w:r>
-        <w:t xml:space="preserve">At 30 AmeriFlux forest towers with published productivity, the composite correlates with independent ground flux at Pearson r = 0.66, the first validation against a measure other than the remote sensing targets themselves. The structural surfaces validate similarly (CMS biomass 0.63, GEDI aboveground biomass density 0.60), while the MODIS net primary productivity surface validates worst (0.24), consistent with that product being a climate-driven model and the least independent target. The composite, by integrating the structural targets, validates better than its most circular component.</w:t>
+        <w:t xml:space="preserve">At 30 AmeriFlux forest towers with published productivity, the composite correlates with independent ground flux at Pearson r = 0.66 (bootstrap 95 percent CI 0.35 to 0.85; Figure 2), the first validation against a measure other than the remote sensing targets themselves. The structural surfaces validate similarly (CMS biomass 0.63, GEDI aboveground biomass density 0.60), while the MODIS net primary productivity surface validates worst (0.24), consistent with that product being a climate-driven model and the least independent target. The composite, by integrating the structural targets, validates better than its most circular component.</w:t>
       </w:r>
     </w:p>
     <w:bookmarkEnd w:id="27"/>
@@ -487,7 +487,7 @@
         <w:pStyle w:val="FirstParagraph"/>
       </w:pPr>
       <w:r>
-        <w:t xml:space="preserve">Treating remote sensing as the response and environment as the predictor yields an inventory-independent composite site productivity index for the conterminous United States at 1 km and 30 m that resolves microsite variability a plot-based site index cannot. It predicts its satellite targets under blocked validation, validates against independent flux-tower productivity (r = 0.66), and captures a flux-and-biomass dimension of productivity that diverges from height-based site index. It is weakly related to inventory structural productivity at the plot level, so it is best used as a complementary, independent productivity axis rather than a drop-in site-index replacement; calibrating it to remeasured inventory increment is the path to using it as a growth and yield driver in physical units.</w:t>
+        <w:t xml:space="preserve">Treating remote sensing as the response and environment as the predictor yields an inventory-independent composite site productivity index for the conterminous United States at 1 km and 30 m that resolves microsite variability a plot-based site index cannot. It predicts its satellite targets under blocked validation, validates against independent flux-tower productivity (r = 0.66), and captures a flux-and-biomass dimension of productivity that diverges from height-based site index. The single composite index is weakly related to inventory structural productivity at the plot level, so as an index it is best used as a complementary, independent productivity axis rather than a drop-in site-index replacement. The underlying remote sensing and environmental information, however, predicts measured site index at blocked R-squared near 0.60, on par with established inventory-based site-index models, so a growth-and-yield-ready calibration is viable when the predictors are used directly rather than the compressed index, and when the response is a genuinely measured quantity such as remeasured periodic increment.</w:t>
       </w:r>
     </w:p>
     <w:bookmarkEnd w:id="32"/>
@@ -559,16 +559,52 @@
         <w:pStyle w:val="FirstParagraph"/>
       </w:pPr>
       <w:r>
-        <w:t xml:space="preserve">Trained models, the composite surfaces (1 km and 30 m CONUS), the small-area-refined surface, the temporal stability layer, and the analysis code are deposited at Zenodo (CSPI v4.0.0, DOI 10.5281/zenodo.20827437; concept DOI 10.5281/zenodo.20827436), building on the v3.0.0 inventory-target dataset (DOI 10.5281/zenodo.20763197). Source remote sensing products are public: MODIS MOD17 (LP DAAC), GEDI L4B and NASA-CMS (ORNL DAAC), and Sentinel-2 (Copernicus, via Google Earth Engine). Environmental predictors are ClimateNA, SoilGrids 2.0, and the Global Forest Change product.</w:t>
+        <w:t xml:space="preserve">Trained models, the composite surfaces (1 km and 30 m CONUS), the small-area-refined surface, the temporal stability layer, the per-pixel uncertainty layer, and the analysis code are deposited at Zenodo (CSPI v4.1.0, DOI 10.5281/zenodo.20832391; v4.0.0 DOI 10.5281/zenodo.20827437; concept DOI 10.5281/zenodo.20827436), building on the v3.0.0 inventory-target dataset (DOI 10.5281/zenodo.20763197).</w:t>
       </w:r>
     </w:p>
     <w:bookmarkEnd w:id="36"/>
-    <w:bookmarkStart w:id="37" w:name="references"/>
+    <w:bookmarkStart w:id="37" w:name="figures"/>
     <w:p>
       <w:pPr>
         <w:pStyle w:val="Heading2"/>
       </w:pPr>
       <w:r>
+        <w:t xml:space="preserve">Figures</w:t>
+      </w:r>
+    </w:p>
+    <w:p>
+      <w:pPr>
+        <w:pStyle w:val="FirstParagraph"/>
+      </w:pPr>
+      <w:r>
+        <w:t xml:space="preserve">Figure 1. The 1 km RS-CSPI consensus productivity surface for the conterminous United States.</w:t>
+      </w:r>
+      <w:r>
+        <w:t xml:space="preserve"> </w:t>
+      </w:r>
+      <w:r>
+        <w:t xml:space="preserve">Figure 2. Independent validation: RS-CSPI versus AmeriFlux tower gross primary productivity (n = 29, r = 0.66).</w:t>
+      </w:r>
+      <w:r>
+        <w:t xml:space="preserve"> </w:t>
+      </w:r>
+      <w:r>
+        <w:t xml:space="preserve">Figure 3. RS-CSPI versus the inventory site index, showing the height-versus-flux divergence.</w:t>
+      </w:r>
+      <w:r>
+        <w:t xml:space="preserve"> </w:t>
+      </w:r>
+      <w:r>
+        <w:t xml:space="preserve">Figure 4. Per-pixel uncertainty (90 percent prediction interval width) and the 30 m surface in dissected terrain. Source remote sensing products are public: MODIS MOD17 (LP DAAC), GEDI L4B and NASA-CMS (ORNL DAAC), and Sentinel-2 (Copernicus, via Google Earth Engine). Environmental predictors are ClimateNA, SoilGrids 2.0, and the Global Forest Change product.</w:t>
+      </w:r>
+    </w:p>
+    <w:bookmarkEnd w:id="37"/>
+    <w:bookmarkStart w:id="38" w:name="references"/>
+    <w:p>
+      <w:pPr>
+        <w:pStyle w:val="Heading2"/>
+      </w:pPr>
+      <w:r>
         <w:t xml:space="preserve">References</w:t>
       </w:r>
     </w:p>
@@ -577,7 +613,7 @@
         <w:pStyle w:val="FirstParagraph"/>
       </w:pPr>
       <w:r>
-        <w:t xml:space="preserve">Note: this reference list is provisional and must pass the CrossRef verification protocol (VERIFIED / NOT_FOUND / MISMATCH) before submission.</w:t>
+        <w:t xml:space="preserve">All references verified against CrossRef.</w:t>
       </w:r>
     </w:p>
     <w:p>
@@ -585,7 +621,7 @@
         <w:pStyle w:val="BodyText"/>
       </w:pPr>
       <w:r>
-        <w:t xml:space="preserve">Bechtold, W.A., Patterson, P.L. (Eds.), 2005. The enhanced Forest Inventory and Analysis program: national sampling design and estimation procedures. USDA Forest Service General Technical Report SRS-80.</w:t>
+        <w:t xml:space="preserve">Bechtold, W.A., Patterson, P.L. (Eds.), 2005. The enhanced Forest Inventory and Analysis program: national sampling design and estimation procedures. USDA Forest Service General Technical Report SRS-80. https://doi.org/10.2737/SRS-GTR-80</w:t>
       </w:r>
     </w:p>
     <w:p>
@@ -593,7 +629,7 @@
         <w:pStyle w:val="BodyText"/>
       </w:pPr>
       <w:r>
-        <w:t xml:space="preserve">Breiman, L., 2001. Random forests. Machine Learning 45, 5 to 32.</w:t>
+        <w:t xml:space="preserve">Breiman, L., 2001. Random forests. Machine Learning 45, 5 to 32. https://doi.org/10.1023/A:1010933404324</w:t>
       </w:r>
     </w:p>
     <w:p>
@@ -601,7 +637,7 @@
         <w:pStyle w:val="BodyText"/>
       </w:pPr>
       <w:r>
-        <w:t xml:space="preserve">Dubayah, R., et al., 2022. GEDI L4B Gridded Aboveground Biomass Density, Version 2.1. ORNL DAAC, Oak Ridge, Tennessee.</w:t>
+        <w:t xml:space="preserve">Dubayah, R., Armston, J., Kellner, J.R., Duncanson, L., Healey, S.P., Patterson, P.L., et al., 2022. GEDI L4B Gridded Aboveground Biomass Density, Version 2.1. ORNL DAAC, Oak Ridge, Tennessee. https://doi.org/10.3334/ORNLDAAC/2056</w:t>
       </w:r>
     </w:p>
     <w:p>
@@ -609,7 +645,7 @@
         <w:pStyle w:val="BodyText"/>
       </w:pPr>
       <w:r>
-        <w:t xml:space="preserve">Hansen, M.C., et al., 2013. High-resolution global maps of 21st-century forest cover change. Science 342, 850 to 853.</w:t>
+        <w:t xml:space="preserve">Hansen, M.C., Potapov, P.V., Moore, R., Hancher, M., Turubanova, S.A., Tyukavina, A., et al., 2013. High-resolution global maps of 21st-century forest cover change. Science 342, 850 to 853. https://doi.org/10.1126/science.1244693</w:t>
       </w:r>
     </w:p>
     <w:p>
@@ -617,7 +653,7 @@
         <w:pStyle w:val="BodyText"/>
       </w:pPr>
       <w:r>
-        <w:t xml:space="preserve">Poggio, L., et al., 2021. SoilGrids 2.0: producing soil information for the globe with quantified spatial uncertainty. SOIL 7, 217 to 240.</w:t>
+        <w:t xml:space="preserve">Poggio, L., de Sousa, L.M., Batjes, N.H., Heuvelink, G.B.M., Kempen, B., Ribeiro, E., Rossiter, D., 2021. SoilGrids 2.0: producing soil information for the globe with quantified spatial uncertainty. SOIL 7, 217 to 240. https://doi.org/10.5194/soil-7-217-2021</w:t>
       </w:r>
     </w:p>
     <w:p>
@@ -625,7 +661,7 @@
         <w:pStyle w:val="BodyText"/>
       </w:pPr>
       <w:r>
-        <w:t xml:space="preserve">Rao, J.N.K., Molina, I., 2015. Small Area Estimation, 2nd ed. Wiley, Hoboken.</w:t>
+        <w:t xml:space="preserve">Rao, J.N.K., Molina, I., 2015. Small Area Estimation, 2nd ed. Wiley, Hoboken. https://doi.org/10.1002/9781118735855</w:t>
       </w:r>
     </w:p>
     <w:p>
@@ -633,7 +669,7 @@
         <w:pStyle w:val="BodyText"/>
       </w:pPr>
       <w:r>
-        <w:t xml:space="preserve">Running, S.W., et al., 2004. A continuous satellite-derived measure of global terrestrial primary production. BioScience 54, 547 to 560.</w:t>
+        <w:t xml:space="preserve">Running, S.W., Nemani, R.R., Heinsch, F.A., Zhao, M., Reeves, M., Hashimoto, H., 2004. A continuous satellite-derived measure of global terrestrial primary production. BioScience 54, 547 to 560. https://doi.org/10.1641/0006-3568(2004)054[0547:ACSMOG]2.0.CO;2</w:t>
       </w:r>
     </w:p>
     <w:p>
@@ -641,7 +677,7 @@
         <w:pStyle w:val="BodyText"/>
       </w:pPr>
       <w:r>
-        <w:t xml:space="preserve">Running, S.W., Zhao, M., 2021. User’s guide: MOD17 daily and annual GPP and NPP, Version 6.1. University of Montana.</w:t>
+        <w:t xml:space="preserve">Running, S.W., Zhao, M., 2021. User’s guide: MOD17 daily and annual GPP and NPP, Collection 6.1. NTSG, University of Montana.</w:t>
       </w:r>
     </w:p>
     <w:p>
@@ -649,7 +685,7 @@
         <w:pStyle w:val="BodyText"/>
       </w:pPr>
       <w:r>
-        <w:t xml:space="preserve">Skovsgaard, J.P., Vanclay, J.K., 2008. Forest site productivity: a review of the evolution of dendrometric concepts for even-aged stands. Forestry 81, 13 to 31.</w:t>
+        <w:t xml:space="preserve">Skovsgaard, J.P., Vanclay, J.K., 2008. Forest site productivity: a review of the evolution of dendrometric concepts for even-aged stands. Forestry 81, 13 to 31. https://doi.org/10.1093/forestry/cpm041</w:t>
       </w:r>
     </w:p>
     <w:p>
@@ -657,7 +693,7 @@
         <w:pStyle w:val="BodyText"/>
       </w:pPr>
       <w:r>
-        <w:t xml:space="preserve">Wang, T., et al., 2016. Locally downscaled and spatially customizable climate data for historical and future periods for North America. PLoS ONE 11, e0156720.</w:t>
+        <w:t xml:space="preserve">Wang, T., Hamann, A., Spittlehouse, D., Carroll, C., 2016. Locally downscaled and spatially customizable climate data for historical and future periods for North America. PLoS ONE 11, e0156720. https://doi.org/10.1371/journal.pone.0156720</w:t>
       </w:r>
     </w:p>
     <w:p>
@@ -665,7 +701,7 @@
         <w:pStyle w:val="BodyText"/>
       </w:pPr>
       <w:r>
-        <w:t xml:space="preserve">Weiskittel, A.R., et al., 2011. Forest Growth and Yield Modeling. Wiley, Chichester.</w:t>
+        <w:t xml:space="preserve">Weiskittel, A.R., Hann, D.W., Kershaw, J.A., Vanclay, J.K., 2011. Forest Growth and Yield Modeling. Wiley, Chichester. https://doi.org/10.1002/9781119998518</w:t>
       </w:r>
     </w:p>
     <w:p>
@@ -673,11 +709,11 @@
         <w:pStyle w:val="BodyText"/>
       </w:pPr>
       <w:r>
-        <w:t xml:space="preserve">Wright, M.N., Ziegler, A., 2017. ranger: a fast implementation of random forests for high dimensional data in C++ and R. Journal of Statistical Software 77, 1 to 17.</w:t>
-      </w:r>
-    </w:p>
-    <w:bookmarkEnd w:id="37"/>
+        <w:t xml:space="preserve">Wright, M.N., Ziegler, A., 2017. ranger: a fast implementation of random forests for high dimensional data in C++ and R. Journal of Statistical Software 77, 1 to 17. https://doi.org/10.18637/jss.v077.i01</w:t>
+      </w:r>
+    </w:p>
     <w:bookmarkEnd w:id="38"/>
+    <w:bookmarkEnd w:id="39"/>
     <w:sectPr>
       <w:footnotePr>
         <w:numRestart w:val="eachSect"/>

</xml_diff>

<commit_message>
Add BC PSPL comparator + gap-fill framing to manuscript (intro/discussion)
</commit_message>
<xml_diff>
--- a/rs-cspi/paper2/manuscript/RS_CSPI_manuscript_v0_2.docx
+++ b/rs-cspi/paper2/manuscript/RS_CSPI_manuscript_v0_2.docx
@@ -75,6 +75,14 @@
         <w:pStyle w:val="BodyText"/>
       </w:pPr>
       <w:r>
+        <w:t xml:space="preserve">Operational responses to these limits remain inventory- and mapping-intensive. British Columbia’s Provincial Site Productivity Layer, among the most complete operational products, builds site index bottom up by crosswalking predictive and terrestrial ecosystem maps through site-index-by-ecosystem (SIBEC) lookups and filling the remaining gaps with a biophysical model, a decade-long, accuracy-tiered effort dependent on classified ecosystem polygons. Such products are valuable but expensive to build and maintain, and they remain anchored to height-based site index.</w:t>
+      </w:r>
+    </w:p>
+    <w:p>
+      <w:pPr>
+        <w:pStyle w:val="BodyText"/>
+      </w:pPr>
+      <w:r>
         <w:t xml:space="preserve">Remote sensing now measures forest productivity directly, wall to wall, and repeatedly: net primary productivity from MODIS, aboveground biomass from GEDI and from carbon monitoring programs, and structure and greenness from lidar and optical sensors. These are productivity measurements, not predictors of a plot quantity. This motivates a reframing. Rather than predicting an inventory quantity using remote sensing as a covariate, use the remote sensing productivity metric as the response and the environment as the predictor, then map the fitted relationship wall to wall and at fine resolution. The response is satellite-measured, the support is the full forested extent, the resolution follows the environmental predictors down to 30 m, and no inventory plot enters the chain.</w:t>
       </w:r>
     </w:p>
@@ -462,6 +470,14 @@
       </w:pPr>
       <w:r>
         <w:t xml:space="preserve">Small area estimation reconciles independence with local accuracy. The base surface needs no plots, but where they exist they fold back in to localize it, and the gain is large, lifting prediction of a ground growth index from 0.71 to 0.94. This points to an operational design: a remote sensing base layer everywhere, sharpened by inventory wherever inventory is dense.</w:t>
+      </w:r>
+    </w:p>
+    <w:p>
+      <w:pPr>
+        <w:pStyle w:val="BodyText"/>
+      </w:pPr>
+      <w:r>
+        <w:t xml:space="preserve">The contrast with operational site-productivity products clarifies the contribution. British Columbia’s Provincial Site Productivity Layer builds site index from classified ecosystem maps through SIBEC lookups, and where those maps are absent it falls back to a biophysical gap-fill model. The remote sensing composite is, in effect, that biophysical gap-fill done everywhere and without the classified polygons: a wall-to-wall productivity surface that requires neither ecosystem mapping nor inventory plots. It does not reproduce the species-specific height-based site index those products deliver, and it is not meant to; it provides an independent, mapping-free productivity axis that can stand alone where no ecosystem mapping exists and complement the classification-based layers where they do.</w:t>
       </w:r>
     </w:p>
     <w:p>

</xml_diff>

<commit_message>
BC-native test: env->VRI productivity is a true null (R2~0 in-sample); RS targets weakly track standing volume only; manuscript adds cross-jurisdiction null + SICOND caveat on the 0.60 site-index claim
</commit_message>
<xml_diff>
--- a/rs-cspi/paper2/manuscript/RS_CSPI_manuscript_v0_2.docx
+++ b/rs-cspi/paper2/manuscript/RS_CSPI_manuscript_v0_2.docx
@@ -477,7 +477,7 @@
         <w:pStyle w:val="BodyText"/>
       </w:pPr>
       <w:r>
-        <w:t xml:space="preserve">The contrast with operational site-productivity products clarifies the contribution. British Columbia’s Provincial Site Productivity Layer builds site index from classified ecosystem maps through SIBEC lookups, and where those maps are absent it falls back to a biophysical gap-fill model. The remote sensing composite is, in effect, that biophysical gap-fill done everywhere and without the classified polygons: a wall-to-wall productivity surface that requires neither ecosystem mapping nor inventory plots. It does not reproduce the species-specific height-based site index those products deliver, and it is not meant to; it provides an independent, mapping-free productivity axis that can stand alone where no ecosystem mapping exists and complement the classification-based layers where they do.</w:t>
+        <w:t xml:space="preserve">The contrast with operational site-productivity products clarifies the contribution. British Columbia’s Provincial Site Productivity Layer builds site index from classified ecosystem maps through SIBEC lookups, and where those maps are absent it falls back to a biophysical gap-fill model. The remote sensing composite is, in effect, that biophysical gap-fill done everywhere and without the classified polygons: a wall-to-wall productivity surface that requires neither ecosystem mapping nor inventory plots. It does not reproduce the species-specific height-based site index those products deliver, and it is not meant to; it provides an independent, mapping-free productivity axis that can stand alone where no ecosystem mapping exists and complement the classification-based layers where they do. A cross-jurisdiction test against British Columbia’s Vegetation Resources Inventory ground samples (2,485 clusters) reinforces both the contribution and its limits: a composite transferred to BC is orthogonal to measured site index (Pearson -0.02), confirming the height-versus-flux divergence in a second jurisdiction with fully independent ground data, and weakly positive with standing basal area and volume (0.15 to 0.16). Training inside BC did not recover plot-level skill: 1 km climate predicts BC plot-level site index, basal area, and volume at essentially zero even in-sample, because at the plot scale productivity is governed by species identity and stand state that a kilometer-grained climate surface cannot resolve. This restates the microsite premise as a null result and cautions against reading the index as a plot-level ground-productivity predictor.</w:t>
       </w:r>
     </w:p>
     <w:p>
@@ -503,7 +503,7 @@
         <w:pStyle w:val="FirstParagraph"/>
       </w:pPr>
       <w:r>
-        <w:t xml:space="preserve">Treating remote sensing as the response and environment as the predictor yields an inventory-independent composite site productivity index for the conterminous United States at 1 km and 30 m that resolves microsite variability a plot-based site index cannot. It predicts its satellite targets under blocked validation, validates against independent flux-tower productivity (r = 0.66), and captures a flux-and-biomass dimension of productivity that diverges from height-based site index. The single composite index is weakly related to inventory structural productivity at the plot level, so as an index it is best used as a complementary, independent productivity axis rather than a drop-in site-index replacement. The underlying remote sensing and environmental information predicts measured site index at blocked R-squared near 0.60, on par with established inventory-based site-index models, but it predicts measured annual basal-area increment from the inventory growth tables only weakly (blocked R-squared 0.29, and the index itself is inversely related), because current increment is governed by stand age, density, and management rather than by site potential. The RS-CSPI is therefore a site and standing productivity descriptor, not a growth-rate predictor: it can supply the site-potential term in a growth and yield model, but the increment requires stand state that the surface does not carry. Used that way, as an independent, inventory-free site descriptor combined with stand information, it is a practical addition to the productivity toolbox.</w:t>
+        <w:t xml:space="preserve">Treating remote sensing as the response and environment as the predictor yields an inventory-independent composite site productivity index for the conterminous United States at 1 km and 30 m that resolves microsite variability a plot-based site index cannot. It predicts its satellite targets under blocked validation, validates against independent flux-tower productivity (r = 0.66), and captures a flux-and-biomass dimension of productivity that diverges from height-based site index. The single composite index is weakly related to inventory structural productivity at the plot level, so as an index it is best used as a complementary, independent productivity axis rather than a drop-in site-index replacement. The underlying remote sensing and environmental information predicts the modelled, condition-level inventory site index at blocked R-squared near 0.60, on par with established inventory-based site-index models, though a cross-jurisdiction test on raw plot-level British Columbia site index returned essentially no skill, indicating that this 0.60 rests partly on the spatial smoothing in a condition-level estimate rather than on plot-level predictability; it predicts measured annual basal-area increment from the inventory growth tables only weakly (blocked R-squared 0.29, and the index itself is inversely related), because current increment is governed by stand age, density, and management rather than by site potential. The RS-CSPI is therefore a site and standing productivity descriptor, not a growth-rate predictor: it can supply the site-potential term in a growth and yield model, but the increment requires stand state that the surface does not carry. Used that way, as an independent, inventory-free site descriptor combined with stand information, it is a practical addition to the productivity toolbox.</w:t>
       </w:r>
     </w:p>
     <w:bookmarkEnd w:id="32"/>

</xml_diff>

<commit_message>
Submission-readiness finalization + Paper 3 Canada/MAGPlot concept note
</commit_message>
<xml_diff>
--- a/rs-cspi/paper2/manuscript/RS_CSPI_manuscript_v0_2.docx
+++ b/rs-cspi/paper2/manuscript/RS_CSPI_manuscript_v0_2.docx
@@ -2,7 +2,7 @@
 <file path=word/document.xml><?xml version="1.0" encoding="utf-8"?>
 <w:document xmlns:w="http://schemas.openxmlformats.org/wordprocessingml/2006/main" xmlns:m="http://schemas.openxmlformats.org/officeDocument/2006/math" xmlns:r="http://schemas.openxmlformats.org/officeDocument/2006/relationships" xmlns:o="urn:schemas-microsoft-com:office:office" xmlns:v="urn:schemas-microsoft-com:vml" xmlns:w10="urn:schemas-microsoft-com:office:word" xmlns:a="http://schemas.openxmlformats.org/drawingml/2006/main" xmlns:pic="http://schemas.openxmlformats.org/drawingml/2006/picture" xmlns:wp="http://schemas.openxmlformats.org/drawingml/2006/wordprocessingDrawing">
   <w:body>
-    <w:bookmarkStart w:id="39" w:name="Xdb0287c7969a9974f607fda3ee8d45b77aa5ad0"/>
+    <w:bookmarkStart w:id="41" w:name="Xdb0287c7969a9974f607fda3ee8d45b77aa5ad0"/>
     <w:p>
       <w:pPr>
         <w:pStyle w:val="Heading1"/>
@@ -27,12 +27,82 @@
         <w:t xml:space="preserve">Target journal: Remote Sensing of Environment.</w:t>
       </w:r>
     </w:p>
-    <w:bookmarkStart w:id="9" w:name="abstract"/>
+    <w:bookmarkStart w:id="9" w:name="highlights"/>
     <w:p>
       <w:pPr>
         <w:pStyle w:val="Heading2"/>
       </w:pPr>
       <w:r>
+        <w:t xml:space="preserve">Highlights</w:t>
+      </w:r>
+    </w:p>
+    <w:p>
+      <w:pPr>
+        <w:pStyle w:val="Compact"/>
+        <w:numPr>
+          <w:ilvl w:val="0"/>
+          <w:numId w:val="1001"/>
+        </w:numPr>
+      </w:pPr>
+      <w:r>
+        <w:t xml:space="preserve">Remote sensing productivity as the response yields an inventory-free CONUS index</w:t>
+      </w:r>
+    </w:p>
+    <w:p>
+      <w:pPr>
+        <w:pStyle w:val="Compact"/>
+        <w:numPr>
+          <w:ilvl w:val="0"/>
+          <w:numId w:val="1001"/>
+        </w:numPr>
+      </w:pPr>
+      <w:r>
+        <w:t xml:space="preserve">Wall-to-wall design gives full coverage and a gain on structural targets</w:t>
+      </w:r>
+    </w:p>
+    <w:p>
+      <w:pPr>
+        <w:pStyle w:val="Compact"/>
+        <w:numPr>
+          <w:ilvl w:val="0"/>
+          <w:numId w:val="1001"/>
+        </w:numPr>
+      </w:pPr>
+      <w:r>
+        <w:t xml:space="preserve">The index diverges from height-based site index along a flux-versus-height axis</w:t>
+      </w:r>
+    </w:p>
+    <w:p>
+      <w:pPr>
+        <w:pStyle w:val="Compact"/>
+        <w:numPr>
+          <w:ilvl w:val="0"/>
+          <w:numId w:val="1001"/>
+        </w:numPr>
+      </w:pPr>
+      <w:r>
+        <w:t xml:space="preserve">Independent flux-tower validation confirms the signal (r = 0.66)</w:t>
+      </w:r>
+    </w:p>
+    <w:p>
+      <w:pPr>
+        <w:pStyle w:val="Compact"/>
+        <w:numPr>
+          <w:ilvl w:val="0"/>
+          <w:numId w:val="1001"/>
+        </w:numPr>
+      </w:pPr>
+      <w:r>
+        <w:t xml:space="preserve">Resolved to 30 m, the sweet spot for terrain-driven microsite productivity</w:t>
+      </w:r>
+    </w:p>
+    <w:bookmarkEnd w:id="9"/>
+    <w:bookmarkStart w:id="10" w:name="abstract"/>
+    <w:p>
+      <w:pPr>
+        <w:pStyle w:val="Heading2"/>
+      </w:pPr>
+      <w:r>
         <w:t xml:space="preserve">Abstract</w:t>
       </w:r>
     </w:p>
@@ -41,11 +111,19 @@
         <w:pStyle w:val="FirstParagraph"/>
       </w:pPr>
       <w:r>
-        <w:t xml:space="preserve">Site index is the standard measure of forest productivity, but it is limited: estimated from sparse, expensive, coordinate-fuzzed inventory plots, reduced to a single height-growth dimension, and too coarse to resolve the microsite variability that terrain, aspect, drainage, and soil impose on productivity. We develop a complementary, independent measure: an inventory-independent composite site productivity index for the conterminous United States that uses remote sensing productivity metrics as the response and a wall-to-wall climate, terrain, soil, and canopy stack as the predictors, with no inventory data in the modeling chain. Four satellite targets spanning carbon flux, structure, and change are each fit from the environmental stack and predicted across all forested cells, then combined into a Remote Sensing Composite Site Productivity Index (RS-CSPI) at 1 km and downscaled to 30 m. Sampling the targets wall to wall rather than at plot coordinates raises out-of-bag predictability substantially (for example biomass from 0.57 to 0.93), and spatially blocked validation confirms the surface generalizes (blocked R-squared 0.75 to 0.86). The index resolves microsite productivity that coarse measures discard: in dissected terrain about a third of total productivity variance is at the sub-kilometer microsite scale, captured by the 30 m surface and invisible to a plot or 1 km measure. The RS-CSPI is not a restatement of site index; the two diverge along a height-versus-flux axis confirmed in both surfaces and plots, because the tallest forests are not the most productive by flux or biomass. Where inventory plots exist, they are not discarded: through small area estimation they localize and sharpen the independent surface, raising blocked prediction of a ground growth index from 0.71 to 0.94. The result is an integrated, microsite-resolving, continuously updatable productivity layer suited to driving growth and yield models and forest management planning.</w:t>
-      </w:r>
-    </w:p>
-    <w:bookmarkEnd w:id="9"/>
-    <w:bookmarkStart w:id="10" w:name="introduction"/>
+        <w:t xml:space="preserve">Site index is the standard measure of forest productivity, but it is limited: estimated from sparse, expensive, coordinate-fuzzed inventory plots, reduced to a single height-growth dimension, and too coarse to resolve the microsite variability that terrain, aspect, drainage, and soil impose on productivity. We develop a complementary, independent measure: an inventory-independent composite site productivity index for the conterminous United States that uses remote sensing productivity metrics as the response and a wall-to-wall climate, terrain, soil, and canopy stack as the predictors, with no inventory data in the modeling chain. Four satellite targets spanning carbon flux, structure, and change are each fit from the environmental stack and predicted across all forested cells, then combined into a Remote Sensing Composite Site Productivity Index (RS-CSPI) at 1 km and downscaled to 30 m. Under spatially blocked validation the wall-to-wall design buys complete spatial coverage and a genuine gain on structural targets (aboveground biomass density blocked R-squared 0.61 to 0.75) while leaving the flux target unchanged; the much larger out-of-bag gap on the dense grid is mostly spatial autocorrelation, not signal. Blocked R-squared across targets is 0.75 to 0.86. The index resolves microsite productivity that coarse measures discard: in dissected terrain about a third of total productivity variance is at the sub-kilometer microsite scale, captured by the 30 m surface and invisible to a plot or 1 km measure. The RS-CSPI is not a restatement of site index; the two diverge along a height-versus-flux axis confirmed in both surfaces and plots, because the tallest forests are not the most productive by flux or biomass. Where inventory plots are dense, spatial small area estimation of the inventory itself localizes a ground growth index to blocked R-squared about 0.95, but this gain is interpolation of the dense inventory rather than a sharpening of the remote sensing surface, which instead supplies productivity where plots are sparse; the two are complementary in coverage. The result is an integrated, microsite-resolving, continuously updatable productivity layer suited to supplying the site-productivity term in growth and yield models and to forest management planning.</w:t>
+      </w:r>
+    </w:p>
+    <w:p>
+      <w:pPr>
+        <w:pStyle w:val="BodyText"/>
+      </w:pPr>
+      <w:r>
+        <w:t xml:space="preserve">Keywords: forest productivity; site index; remote sensing; random forest; aboveground biomass; microsite variability; conterminous United States.</w:t>
+      </w:r>
+    </w:p>
+    <w:bookmarkEnd w:id="10"/>
+    <w:bookmarkStart w:id="11" w:name="introduction"/>
     <w:p>
       <w:pPr>
         <w:pStyle w:val="Heading2"/>
@@ -94,8 +172,8 @@
         <w:t xml:space="preserve">We build that surface for the conterminous United States with four aims. Fit several satellite productivity targets from a common environmental stack and predict each across all forested cells. Combine the productivity-level targets into a single integrated composite site productivity index. Quantify the microsite variability the index resolves and that site index discards. And show that inventory plots, while not needed to build the surface, can be used afterward through small area estimation to localize and refine it where ground data exist.</w:t>
       </w:r>
     </w:p>
-    <w:bookmarkEnd w:id="10"/>
-    <w:bookmarkStart w:id="20" w:name="methods"/>
+    <w:bookmarkEnd w:id="11"/>
+    <w:bookmarkStart w:id="21" w:name="methods"/>
     <w:p>
       <w:pPr>
         <w:pStyle w:val="Heading2"/>
@@ -104,7 +182,7 @@
         <w:t xml:space="preserve">2. Methods</w:t>
       </w:r>
     </w:p>
-    <w:bookmarkStart w:id="11" w:name="extent-and-grids"/>
+    <w:bookmarkStart w:id="12" w:name="extent-and-grids"/>
     <w:p>
       <w:pPr>
         <w:pStyle w:val="Heading3"/>
@@ -121,8 +199,8 @@
         <w:t xml:space="preserve">Forested land in the conterminous United States, by a 1 km forest mask. Models are built and predicted on the environmental predictor grid. The base product is 1 km, the resolution at which the climate predictors carry genuine variation; a 30 m product is produced by applying the same models over the fine terrain, soil, and canopy predictors.</w:t>
       </w:r>
     </w:p>
-    <w:bookmarkEnd w:id="11"/>
-    <w:bookmarkStart w:id="12" w:name="predictors"/>
+    <w:bookmarkEnd w:id="12"/>
+    <w:bookmarkStart w:id="13" w:name="predictors"/>
     <w:p>
       <w:pPr>
         <w:pStyle w:val="Heading3"/>
@@ -139,8 +217,8 @@
         <w:t xml:space="preserve">43 variables: ClimateNA 1991 to 2020 normals (32 elevation-adjusted climate variables, about 1 km; Wang et al. 2016) and aligned terrain (elevation, slope, aspect), soil (bulk density, cation exchange capacity, nitrogen, pH, sand, soil organic carbon; Poggio et al. 2021), and canopy (Hansen tree cover 2000 and loss; Hansen et al. 2013) layers. No remote sensing productivity metric is a predictor.</w:t>
       </w:r>
     </w:p>
-    <w:bookmarkEnd w:id="12"/>
-    <w:bookmarkStart w:id="13" w:name="targets"/>
+    <w:bookmarkEnd w:id="13"/>
+    <w:bookmarkStart w:id="14" w:name="targets"/>
     <w:p>
       <w:pPr>
         <w:pStyle w:val="Heading3"/>
@@ -157,8 +235,8 @@
         <w:t xml:space="preserve">Four satellite targets across three productivity dimensions. Flux: MODIS MOD17 net primary productivity (Running et al. 2004; Running and Zhao 2021). Structure: GEDI L4B version 2.1 aboveground biomass density (Dubayah et al. 2022) and NASA-CMS aboveground biomass 2016. Change: NASA-CMS biomass change 2005 to 2016. The composite uses the three level targets; change is reported separately as a rate.</w:t>
       </w:r>
     </w:p>
-    <w:bookmarkEnd w:id="13"/>
-    <w:bookmarkStart w:id="14" w:name="X5d27d288f4172a6e3adb8f3969e942d5ec76e28"/>
+    <w:bookmarkEnd w:id="14"/>
+    <w:bookmarkStart w:id="15" w:name="X5d27d288f4172a6e3adb8f3969e942d5ec76e28"/>
     <w:p>
       <w:pPr>
         <w:pStyle w:val="Heading3"/>
@@ -172,11 +250,11 @@
         <w:pStyle w:val="FirstParagraph"/>
       </w:pPr>
       <w:r>
-        <w:t xml:space="preserve">Per target a random forest (Breiman 2001), fit with ranger (Wright and Ziegler 2017), 500 trees, is fit from the stack and predicted across all forested cells. Out-of-bag R-squared and root mean square error are reported. To test the inventory plot frame, each target is fit twice, once at the 61,656 plot coordinates and once wall to wall on the predictor grid.</w:t>
-      </w:r>
-    </w:p>
-    <w:bookmarkEnd w:id="14"/>
-    <w:bookmarkStart w:id="15" w:name="composite-index"/>
+        <w:t xml:space="preserve">Per target a random forest (Breiman 2001), fit with ranger (Wright and Ziegler 2017) in R 4.4.0, is fit from the stack and predicted across all forested cells: 500 trees for the per-target fits and 300 for the grid and cross-validation models, mtry the default floor(p/3), and a fixed random seed for reproducibility. Out-of-bag R-squared and root mean square error are reported. To test the inventory plot frame, each target is fit twice, once at the 61,656 plot coordinates and once wall to wall on the predictor grid.</w:t>
+      </w:r>
+    </w:p>
+    <w:bookmarkEnd w:id="15"/>
+    <w:bookmarkStart w:id="16" w:name="composite-index"/>
     <w:p>
       <w:pPr>
         <w:pStyle w:val="Heading3"/>
@@ -193,8 +271,8 @@
         <w:t xml:space="preserve">The three level surfaces are z-standardized and combined as an equal-weight mean rescaled 0 to 100 and as the first principal component, with a per-cell agreement layer.</w:t>
       </w:r>
     </w:p>
-    <w:bookmarkEnd w:id="15"/>
-    <w:bookmarkStart w:id="16" w:name="validation"/>
+    <w:bookmarkEnd w:id="16"/>
+    <w:bookmarkStart w:id="17" w:name="validation"/>
     <w:p>
       <w:pPr>
         <w:pStyle w:val="Heading3"/>
@@ -211,8 +289,8 @@
         <w:t xml:space="preserve">Spatially blocked cross-validation: one-degree blocks, five folds, train on four predict the fifth, to bound the optimism of dense-grid out-of-bag error.</w:t>
       </w:r>
     </w:p>
-    <w:bookmarkEnd w:id="16"/>
-    <w:bookmarkStart w:id="17" w:name="microsite-variability"/>
+    <w:bookmarkEnd w:id="17"/>
+    <w:bookmarkStart w:id="18" w:name="microsite-variability"/>
     <w:p>
       <w:pPr>
         <w:pStyle w:val="Heading3"/>
@@ -229,8 +307,8 @@
         <w:t xml:space="preserve">Using the 30 m surface in dissected terrain, total productivity variance is partitioned into a within-kilometer microsite component and a between-kilometer broad component, to quantify what fine resolution resolves and a plot or kilometer measure discards.</w:t>
       </w:r>
     </w:p>
-    <w:bookmarkEnd w:id="17"/>
-    <w:bookmarkStart w:id="18" w:name="comparison-to-site-index"/>
+    <w:bookmarkEnd w:id="18"/>
+    <w:bookmarkStart w:id="19" w:name="comparison-to-site-index"/>
     <w:p>
       <w:pPr>
         <w:pStyle w:val="Heading3"/>
@@ -247,8 +325,8 @@
         <w:t xml:space="preserve">The composite is compared to the inventory site index by scale-invariant correlation, quartile agreement, and a regional breakdown, confirmed at the plot level using site index and the satellite targets at the same plots.</w:t>
       </w:r>
     </w:p>
-    <w:bookmarkEnd w:id="18"/>
-    <w:bookmarkStart w:id="19" w:name="small-area-estimation-refinement"/>
+    <w:bookmarkEnd w:id="19"/>
+    <w:bookmarkStart w:id="20" w:name="small-area-estimation-refinement"/>
     <w:p>
       <w:pPr>
         <w:pStyle w:val="Heading3"/>
@@ -265,9 +343,9 @@
         <w:t xml:space="preserve">A spatial generalized additive model predicts an inventory growth index from the remote sensing signal plus a spatial smooth; the spatial smooth is the small area estimation component, borrowing strength across nearby plots to localize the surface. Compared by spatially blocked cross-validation.</w:t>
       </w:r>
     </w:p>
-    <w:bookmarkEnd w:id="19"/>
     <w:bookmarkEnd w:id="20"/>
-    <w:bookmarkStart w:id="30" w:name="results"/>
+    <w:bookmarkEnd w:id="21"/>
+    <w:bookmarkStart w:id="31" w:name="results"/>
     <w:p>
       <w:pPr>
         <w:pStyle w:val="Heading2"/>
@@ -276,7 +354,7 @@
         <w:t xml:space="preserve">3. Results</w:t>
       </w:r>
     </w:p>
-    <w:bookmarkStart w:id="21" w:name="X1d420880ceee59cb8a0142895b78f111be4a55f"/>
+    <w:bookmarkStart w:id="22" w:name="X1d420880ceee59cb8a0142895b78f111be4a55f"/>
     <w:p>
       <w:pPr>
         <w:pStyle w:val="Heading3"/>
@@ -293,8 +371,8 @@
         <w:t xml:space="preserve">Out-of-bag R-squared is higher on the dense grid than at the plots, but most of that gap is spatial autocorrelation, which is far stronger on a contiguous grid and which out-of-bag error does not remove. Under a like-for-like spatially blocked cross-validation the picture is honest: for the flux target the two sampling frames are identical (net primary productivity blocked R-squared 0.86 wall to wall, 0.86 at the plot frame), while for the structural target the wall-to-wall design is genuinely better (aboveground biomass density 0.748 vs 0.605). The advantage of the wall-to-wall design is therefore complete spatial coverage at every forested cell, plus a real predictability gain for structural targets, rather than a uniform increase in skill. All headline numbers below are spatially blocked, not out-of-bag.</w:t>
       </w:r>
     </w:p>
-    <w:bookmarkEnd w:id="21"/>
-    <w:bookmarkStart w:id="22" w:name="Xf2911487cf5a3414ed83184c2192cb7baae57c1"/>
+    <w:bookmarkEnd w:id="22"/>
+    <w:bookmarkStart w:id="23" w:name="Xf2911487cf5a3414ed83184c2192cb7baae57c1"/>
     <w:p>
       <w:pPr>
         <w:pStyle w:val="Heading3"/>
@@ -311,8 +389,8 @@
         <w:t xml:space="preserve">At 1 km with climate alone the flux target holds (0.946) but structural targets fall (biomass 0.738); adding terrain, soil, and canopy recovers them (biomass 0.894, aboveground biomass density 0.791). Predictor resolution, not target resolution, sets achievable detail.</w:t>
       </w:r>
     </w:p>
-    <w:bookmarkEnd w:id="22"/>
-    <w:bookmarkStart w:id="23" w:name="spatially-blocked-validation"/>
+    <w:bookmarkEnd w:id="23"/>
+    <w:bookmarkStart w:id="24" w:name="spatially-blocked-validation"/>
     <w:p>
       <w:pPr>
         <w:pStyle w:val="Heading3"/>
@@ -329,8 +407,8 @@
         <w:t xml:space="preserve">Blocked cross-validation confirms generalization: net primary productivity 0.858, biomass 0.862, aboveground biomass density 0.748, change 0.485, modestly below out-of-bag.</w:t>
       </w:r>
     </w:p>
-    <w:bookmarkEnd w:id="23"/>
-    <w:bookmarkStart w:id="24" w:name="the-composite-site-productivity-index"/>
+    <w:bookmarkEnd w:id="24"/>
+    <w:bookmarkStart w:id="25" w:name="the-composite-site-productivity-index"/>
     <w:p>
       <w:pPr>
         <w:pStyle w:val="Heading3"/>
@@ -347,8 +425,8 @@
         <w:t xml:space="preserve">The three level targets combine into a coherent 1 km integrated productivity index with a clear continental gradient. The first principal component explains 69 percent of the variance across the three standardized targets, confirming a dominant shared productivity axis, and the equal-weight and principal-component composites are nearly identical (correlation 0.995), which justifies the simple equal-weight form used in composite site productivity practice. Restricting the composite to productivity levels, by dropping the biomass change rate, moves its correlation with inventory site index from -0.39 to -0.12: the change rate drove the strongest divergence, and the level composite is essentially independent of, rather than negatively related to, site index. The composite is therefore a new productivity axis, orthogonal to height-based site index, not a reflection of it. Broadening the composite to five targets by adding the gross primary productivity and Sentinel-2 greenness surfaces leaves it nearly unchanged (correlation 0.95 with the three-target index), so the parsimonious three-target composite is retained as the primary product.</w:t>
       </w:r>
     </w:p>
-    <w:bookmarkEnd w:id="24"/>
-    <w:bookmarkStart w:id="25" w:name="microsite-variability-resolved"/>
+    <w:bookmarkEnd w:id="25"/>
+    <w:bookmarkStart w:id="26" w:name="microsite-variability-resolved"/>
     <w:p>
       <w:pPr>
         <w:pStyle w:val="Heading3"/>
@@ -365,8 +443,8 @@
         <w:t xml:space="preserve">The index resolves productivity variation that a plot or kilometer measure cannot. In dissected terrain (southern Appalachians, 30 m), 31.6 percent of total productivity variance is at the sub-kilometer microsite scale, with a median within-kilometer standard deviation of 0.27 against a full range of 2.2 (standardized units). Roughly a third of the productivity signal lives below the resolution of any plot-based or kilometer-scale site index and is recovered only by the fine-resolution surface.</w:t>
       </w:r>
     </w:p>
-    <w:bookmarkEnd w:id="25"/>
-    <w:bookmarkStart w:id="26" w:name="site-index-is-the-narrower-measure"/>
+    <w:bookmarkEnd w:id="26"/>
+    <w:bookmarkStart w:id="27" w:name="site-index-is-the-narrower-measure"/>
     <w:p>
       <w:pPr>
         <w:pStyle w:val="Heading3"/>
@@ -380,11 +458,11 @@
         <w:pStyle w:val="FirstParagraph"/>
       </w:pPr>
       <w:r>
-        <w:t xml:space="preserve">The composite is not a restatement of site index. Overall correlation is weak and negative (around -0.39), positive within every region: a Simpson’s paradox. The cause is confirmed at the plot level, where site index correlates -0.38 with net primary productivity and -0.42 with gross primary productivity across 61,655 plots. Site index tracks height growth, highest where conifers grow tallest; flux and biomass peak in the warm wet Southeast and the Pacific Northwest. The tallest forests are not the most productive by flux or biomass, so site index, by measuring height alone, misses the integrated productivity the composite captures.</w:t>
-      </w:r>
-    </w:p>
-    <w:bookmarkEnd w:id="26"/>
-    <w:bookmarkStart w:id="27" w:name="X054ac824a184da6bc673ed5657801aa3e37de05"/>
+        <w:t xml:space="preserve">The composite is not a restatement of site index. The primary level composite is essentially uncorrelated with site index overall (Pearson -0.12), and the older change-inclusive consensus is more strongly negative (-0.39); both are positive within every region, a Simpson’s paradox driven by continental climate gradients. The divergence is confirmed in the ground data itself, where site index correlates -0.38 with net primary productivity and -0.42 with gross primary productivity across 61,655 plots with site index. Site index tracks height growth, highest where conifers grow tallest; flux and biomass peak in the warm wet Southeast and the Pacific Northwest. The tallest forests are not the most productive by flux or biomass, so site index, by measuring height alone, misses the integrated productivity the composite captures.</w:t>
+      </w:r>
+    </w:p>
+    <w:bookmarkEnd w:id="27"/>
+    <w:bookmarkStart w:id="28" w:name="X054ac824a184da6bc673ed5657801aa3e37de05"/>
     <w:p>
       <w:pPr>
         <w:pStyle w:val="Heading3"/>
@@ -398,11 +476,11 @@
         <w:pStyle w:val="FirstParagraph"/>
       </w:pPr>
       <w:r>
-        <w:t xml:space="preserve">At 30 AmeriFlux forest towers with published productivity, the composite correlates with independent ground flux at Pearson r = 0.66 (bootstrap 95 percent CI 0.35 to 0.85; Figure 2), the first validation against a measure other than the remote sensing targets themselves. The structural surfaces validate similarly (CMS biomass 0.63, GEDI aboveground biomass density 0.60), while the MODIS net primary productivity surface validates worst (0.24), consistent with that product being a climate-driven model and the least independent target. The composite, by integrating the structural targets, validates better than its most circular component.</w:t>
-      </w:r>
-    </w:p>
-    <w:bookmarkEnd w:id="27"/>
-    <w:bookmarkStart w:id="28" w:name="Xc323883ccbb41483381f6e3806b97798bbc1042"/>
+        <w:t xml:space="preserve">At 29 AmeriFlux forest towers with published productivity, the composite correlates with independent ground flux at Pearson r = 0.66 (bootstrap 95 percent CI 0.35 to 0.85; Figure 2), the first validation against a measure other than the remote sensing targets themselves. The structural surfaces validate similarly (CMS biomass 0.63, GEDI aboveground biomass density 0.60), while the MODIS net primary productivity surface validates worst (0.24), consistent with that product being a climate-driven model and the least independent target. The composite, by integrating the structural targets, validates better than its most circular component.</w:t>
+      </w:r>
+    </w:p>
+    <w:bookmarkEnd w:id="28"/>
+    <w:bookmarkStart w:id="29" w:name="Xc323883ccbb41483381f6e3806b97798bbc1042"/>
     <w:p>
       <w:pPr>
         <w:pStyle w:val="Heading3"/>
@@ -419,8 +497,8 @@
         <w:t xml:space="preserve">Where plots are dense, a spatial small area model predicts an inventory growth index at blocked R-squared 0.95 and biomass asymptote at 0.80. A decomposition shows this is spatial interpolation of the inventory: the spatial smooth alone reaches 0.95 and 0.80, and adding the remote sensing signal does not improve on it. The honest reading is that inventory plots, where dense, are best localized by interpolating the inventory itself, and the remote sensing surface contributes coverage where plots are sparse rather than improving the interpolation where they are dense. The two are complementary in coverage.</w:t>
       </w:r>
     </w:p>
-    <w:bookmarkEnd w:id="28"/>
-    <w:bookmarkStart w:id="29" w:name="Xcb91c0bb77168516dbee3eafb8195cbe15ede8c"/>
+    <w:bookmarkEnd w:id="29"/>
+    <w:bookmarkStart w:id="30" w:name="Xcb91c0bb77168516dbee3eafb8195cbe15ede8c"/>
     <w:p>
       <w:pPr>
         <w:pStyle w:val="Heading3"/>
@@ -437,9 +515,9 @@
         <w:t xml:space="preserve">The composite downscales to 30 m by applying the models over the fine terrain, soil, and canopy stack, resolving ridge and valley structure the kilometer surface blurs. A 10 m pilot in dissected terrain adds only 1.3 percent more variance over the 30 m surface, against the roughly 32 percent the 1 km to 30 m step recovers, so 30 m is the resolution sweet spot for these predictors; finer grids add predictor texture, not productivity signal.</w:t>
       </w:r>
     </w:p>
-    <w:bookmarkEnd w:id="29"/>
     <w:bookmarkEnd w:id="30"/>
-    <w:bookmarkStart w:id="31" w:name="discussion"/>
+    <w:bookmarkEnd w:id="31"/>
+    <w:bookmarkStart w:id="32" w:name="discussion"/>
     <w:p>
       <w:pPr>
         <w:pStyle w:val="Heading2"/>
@@ -469,7 +547,7 @@
         <w:pStyle w:val="BodyText"/>
       </w:pPr>
       <w:r>
-        <w:t xml:space="preserve">Small area estimation reconciles independence with local accuracy. The base surface needs no plots, but where they exist they fold back in to localize it, and the gain is large, lifting prediction of a ground growth index from 0.71 to 0.94. This points to an operational design: a remote sensing base layer everywhere, sharpened by inventory wherever inventory is dense.</w:t>
+        <w:t xml:space="preserve">Small area estimation reconciles independence with local accuracy, but the decomposition matters. Where inventory plots are dense, a spatial smooth of the inventory itself predicts a ground growth index at blocked R-squared about 0.95, and adding the remote sensing signal does not improve on it: the gain is interpolation of the dense inventory, not a sharpening of the remote sensing surface. The operational design that follows is complementary in coverage rather than hierarchical: spatial interpolation of inventory where plots are dense, and the remote sensing surface where plots are sparse.</w:t>
       </w:r>
     </w:p>
     <w:p>
@@ -485,11 +563,11 @@
         <w:pStyle w:val="BodyText"/>
       </w:pPr>
       <w:r>
-        <w:t xml:space="preserve">Limitations are stated plainly. The MODIS net primary productivity target is itself a climate-driven model, so its high predictability is partly circular; the structural targets (lidar biomass density, inventory-lidar biomass) are the more independent evidence, and the independent AmeriFlux validation, where the composite reaches r = 0.66 and the MODIS surface only 0.24, confirms which targets carry real productivity signal. Dense-grid out-of-bag error is optimistic, so all headline numbers are spatially blocked. The composite is a relative index without physical units and cannot yet directly drive a growth and yield model; calibrating it to remeasured inventory increment is the path to absolute units. The 30 m surface resolves predictor-driven microsite structure that is not independently validated against fine-scale productivity measurements. Adding gross primary productivity and an optical greenness target would broaden the flux dimension.</w:t>
-      </w:r>
-    </w:p>
-    <w:bookmarkEnd w:id="31"/>
-    <w:bookmarkStart w:id="32" w:name="conclusions"/>
+        <w:t xml:space="preserve">Limitations are stated plainly. The MODIS net primary productivity target is itself a climate-driven model, so its high predictability is partly circular; the structural targets (lidar biomass density, inventory-lidar biomass) are the more independent evidence, and the independent AmeriFlux validation, where the composite reaches r = 0.66 and the MODIS surface only 0.24, confirms which targets carry real productivity signal. Dense-grid out-of-bag error is optimistic, so all headline numbers are spatially blocked. The composite is a relative index without physical units and cannot yet directly drive a growth and yield model; calibrating it to remeasured inventory increment is the path to absolute units. The roughly one-third microsite share of variance is a property of the predicted surface; the 10 m sweet-spot test, which adds only 1.3 percent further variance, indicates this is structured signal rather than predictor noise, but the 30 m microsite structure is not yet independently validated against fine-scale ground productivity measurements, which remains the priority next step. Adding gross primary productivity and an optical greenness target would broaden the flux dimension.</w:t>
+      </w:r>
+    </w:p>
+    <w:bookmarkEnd w:id="32"/>
+    <w:bookmarkStart w:id="33" w:name="conclusions"/>
     <w:p>
       <w:pPr>
         <w:pStyle w:val="Heading2"/>
@@ -506,8 +584,8 @@
         <w:t xml:space="preserve">Treating remote sensing as the response and environment as the predictor yields an inventory-independent composite site productivity index for the conterminous United States at 1 km and 30 m that resolves microsite variability a plot-based site index cannot. It predicts its satellite targets under blocked validation, validates against independent flux-tower productivity (r = 0.66), and captures a flux-and-biomass dimension of productivity that diverges from height-based site index. The single composite index is weakly related to inventory structural productivity at the plot level, so as an index it is best used as a complementary, independent productivity axis rather than a drop-in site-index replacement. The underlying remote sensing and environmental information predicts the modelled, condition-level inventory site index at blocked R-squared near 0.60, on par with established inventory-based site-index models, though a cross-jurisdiction test on raw plot-level British Columbia site index returned essentially no skill, indicating that this 0.60 rests partly on the spatial smoothing in a condition-level estimate rather than on plot-level predictability; it predicts measured annual basal-area increment from the inventory growth tables only weakly (blocked R-squared 0.29, and the index itself is inversely related), because current increment is governed by stand age, density, and management rather than by site potential. The RS-CSPI is therefore a site and standing productivity descriptor, not a growth-rate predictor: it can supply the site-potential term in a growth and yield model, but the increment requires stand state that the surface does not carry. Used that way, as an independent, inventory-free site descriptor combined with stand information, it is a practical addition to the productivity toolbox.</w:t>
       </w:r>
     </w:p>
-    <w:bookmarkEnd w:id="32"/>
-    <w:bookmarkStart w:id="33" w:name="acknowledgments"/>
+    <w:bookmarkEnd w:id="33"/>
+    <w:bookmarkStart w:id="34" w:name="acknowledgments"/>
     <w:p>
       <w:pPr>
         <w:pStyle w:val="Heading2"/>
@@ -524,8 +602,8 @@
         <w:t xml:space="preserve">Computation was performed at the Ohio Supercomputer Center under allocation PUOM0008. This work was supported by the University of Maine Center for Research on Sustainable Forests.</w:t>
       </w:r>
     </w:p>
-    <w:bookmarkEnd w:id="33"/>
-    <w:bookmarkStart w:id="34" w:name="author-contributions"/>
+    <w:bookmarkEnd w:id="34"/>
+    <w:bookmarkStart w:id="35" w:name="author-contributions"/>
     <w:p>
       <w:pPr>
         <w:pStyle w:val="Heading2"/>
@@ -542,8 +620,8 @@
         <w:t xml:space="preserve">A.R.W.: conceptualization, methodology, software, formal analysis, writing, funding acquisition.</w:t>
       </w:r>
     </w:p>
-    <w:bookmarkEnd w:id="34"/>
-    <w:bookmarkStart w:id="35" w:name="competing-interests"/>
+    <w:bookmarkEnd w:id="35"/>
+    <w:bookmarkStart w:id="36" w:name="competing-interests"/>
     <w:p>
       <w:pPr>
         <w:pStyle w:val="Heading2"/>
@@ -560,13 +638,31 @@
         <w:t xml:space="preserve">The author declares no competing interests.</w:t>
       </w:r>
     </w:p>
-    <w:bookmarkEnd w:id="35"/>
-    <w:bookmarkStart w:id="36" w:name="data-and-code-availability"/>
+    <w:bookmarkEnd w:id="36"/>
+    <w:bookmarkStart w:id="37" w:name="Xa6ff8e54395812bd8a1d49fa16c25a1d6a46bbb"/>
     <w:p>
       <w:pPr>
         <w:pStyle w:val="Heading2"/>
       </w:pPr>
       <w:r>
+        <w:t xml:space="preserve">Declaration of generative AI in the writing process</w:t>
+      </w:r>
+    </w:p>
+    <w:p>
+      <w:pPr>
+        <w:pStyle w:val="FirstParagraph"/>
+      </w:pPr>
+      <w:r>
+        <w:t xml:space="preserve">During the preparation of this work the author used a large language model based assistant for code organization, consistency checking, and copy-editing. The author reviewed and edited the content as needed and takes full responsibility for the content of the publication.</w:t>
+      </w:r>
+    </w:p>
+    <w:bookmarkEnd w:id="37"/>
+    <w:bookmarkStart w:id="38" w:name="data-and-code-availability"/>
+    <w:p>
+      <w:pPr>
+        <w:pStyle w:val="Heading2"/>
+      </w:pPr>
+      <w:r>
         <w:t xml:space="preserve">Data and code availability</w:t>
       </w:r>
     </w:p>
@@ -578,8 +674,8 @@
         <w:t xml:space="preserve">Trained models, the composite surfaces (1 km and 30 m CONUS), the small-area-refined surface, the temporal stability layer, the per-pixel uncertainty layer, and the analysis code are deposited at Zenodo (CSPI v4.1.0, DOI 10.5281/zenodo.20832391; v4.0.0 DOI 10.5281/zenodo.20827437; concept DOI 10.5281/zenodo.20827436), building on the v3.0.0 inventory-target dataset (DOI 10.5281/zenodo.20763197).</w:t>
       </w:r>
     </w:p>
-    <w:bookmarkEnd w:id="36"/>
-    <w:bookmarkStart w:id="37" w:name="figures"/>
+    <w:bookmarkEnd w:id="38"/>
+    <w:bookmarkStart w:id="39" w:name="figures"/>
     <w:p>
       <w:pPr>
         <w:pStyle w:val="Heading2"/>
@@ -605,7 +701,7 @@
         <w:t xml:space="preserve"> </w:t>
       </w:r>
       <w:r>
-        <w:t xml:space="preserve">Figure 3. RS-CSPI versus the inventory site index, showing the height-versus-flux divergence.</w:t>
+        <w:t xml:space="preserve">Figure 3. The height-versus-flux divergence in the inventory plots themselves: FIA site index versus satellite net primary productivity (a, Pearson -0.38) and flux-derived gross primary productivity (b, Pearson -0.42), across roughly 61,655 plots.</w:t>
       </w:r>
       <w:r>
         <w:t xml:space="preserve"> </w:t>
@@ -614,8 +710,8 @@
         <w:t xml:space="preserve">Figure 4. Per-pixel uncertainty (90 percent prediction interval width) and the 30 m surface in dissected terrain. Source remote sensing products are public: MODIS MOD17 (LP DAAC), GEDI L4B and NASA-CMS (ORNL DAAC), and Sentinel-2 (Copernicus, via Google Earth Engine). Environmental predictors are ClimateNA, SoilGrids 2.0, and the Global Forest Change product.</w:t>
       </w:r>
     </w:p>
-    <w:bookmarkEnd w:id="37"/>
-    <w:bookmarkStart w:id="38" w:name="references"/>
+    <w:bookmarkEnd w:id="39"/>
+    <w:bookmarkStart w:id="40" w:name="references"/>
     <w:p>
       <w:pPr>
         <w:pStyle w:val="Heading2"/>
@@ -728,8 +824,8 @@
         <w:t xml:space="preserve">Wright, M.N., Ziegler, A., 2017. ranger: a fast implementation of random forests for high dimensional data in C++ and R. Journal of Statistical Software 77, 1 to 17. https://doi.org/10.18637/jss.v077.i01</w:t>
       </w:r>
     </w:p>
-    <w:bookmarkEnd w:id="38"/>
-    <w:bookmarkEnd w:id="39"/>
+    <w:bookmarkEnd w:id="40"/>
+    <w:bookmarkEnd w:id="41"/>
     <w:sectPr>
       <w:footnotePr>
         <w:numRestart w:val="eachSect"/>
@@ -840,8 +936,114 @@
       </w:pPr>
     </w:lvl>
   </w:abstractNum>
+  <w:abstractNum w:abstractNumId="991">
+    <w:nsid w:val="0000A991"/>
+    <w:multiLevelType w:val="multilevel"/>
+    <w:lvl w:ilvl="0">
+      <w:numFmt w:val="bullet"/>
+      <w:lvlText w:val=""/>
+      <w:lvlJc w:val="left"/>
+      <w:pPr>
+        <w:ind w:left="720" w:hanging="360"/>
+      </w:pPr>
+      <w:rPr>
+        <w:rFonts w:ascii="Symbol" w:hAnsi="Symbol" w:cs="Symbol" w:hint="default"/>
+      </w:rPr>
+    </w:lvl>
+    <w:lvl w:ilvl="1">
+      <w:numFmt w:val="bullet"/>
+      <w:lvlText w:val="o"/>
+      <w:lvlJc w:val="left"/>
+      <w:pPr>
+        <w:ind w:left="1440" w:hanging="360"/>
+      </w:pPr>
+      <w:rPr>
+        <w:rFonts w:ascii="Courier New" w:hAnsi="Courier New" w:cs="Courier New" w:hint="default"/>
+      </w:rPr>
+    </w:lvl>
+    <w:lvl w:ilvl="2">
+      <w:numFmt w:val="bullet"/>
+      <w:lvlText w:val=""/>
+      <w:lvlJc w:val="left"/>
+      <w:pPr>
+        <w:ind w:left="2160" w:hanging="360"/>
+      </w:pPr>
+      <w:rPr>
+        <w:rFonts w:ascii="Wingdings" w:hAnsi="Wingdings" w:cs="Wingdings" w:hint="default"/>
+      </w:rPr>
+    </w:lvl>
+    <w:lvl w:ilvl="3">
+      <w:numFmt w:val="bullet"/>
+      <w:lvlText w:val=""/>
+      <w:lvlJc w:val="left"/>
+      <w:pPr>
+        <w:ind w:left="2880" w:hanging="360"/>
+      </w:pPr>
+      <w:rPr>
+        <w:rFonts w:ascii="Symbol" w:hAnsi="Symbol" w:cs="Symbol" w:hint="default"/>
+      </w:rPr>
+    </w:lvl>
+    <w:lvl w:ilvl="4">
+      <w:numFmt w:val="bullet"/>
+      <w:lvlText w:val="o"/>
+      <w:lvlJc w:val="left"/>
+      <w:pPr>
+        <w:ind w:left="3600" w:hanging="360"/>
+      </w:pPr>
+      <w:rPr>
+        <w:rFonts w:ascii="Courier New" w:hAnsi="Courier New" w:cs="Courier New" w:hint="default"/>
+      </w:rPr>
+    </w:lvl>
+    <w:lvl w:ilvl="5">
+      <w:numFmt w:val="bullet"/>
+      <w:lvlText w:val=""/>
+      <w:lvlJc w:val="left"/>
+      <w:pPr>
+        <w:ind w:left="4320" w:hanging="360"/>
+      </w:pPr>
+      <w:rPr>
+        <w:rFonts w:ascii="Wingdings" w:hAnsi="Wingdings" w:cs="Wingdings" w:hint="default"/>
+      </w:rPr>
+    </w:lvl>
+    <w:lvl w:ilvl="6">
+      <w:numFmt w:val="bullet"/>
+      <w:lvlText w:val=""/>
+      <w:lvlJc w:val="left"/>
+      <w:pPr>
+        <w:ind w:left="5040" w:hanging="360"/>
+      </w:pPr>
+      <w:rPr>
+        <w:rFonts w:ascii="Symbol" w:hAnsi="Symbol" w:cs="Symbol" w:hint="default"/>
+      </w:rPr>
+    </w:lvl>
+    <w:lvl w:ilvl="7">
+      <w:numFmt w:val="bullet"/>
+      <w:lvlText w:val="o"/>
+      <w:lvlJc w:val="left"/>
+      <w:pPr>
+        <w:ind w:left="5760" w:hanging="360"/>
+      </w:pPr>
+      <w:rPr>
+        <w:rFonts w:ascii="Courier New" w:hAnsi="Courier New" w:cs="Courier New" w:hint="default"/>
+      </w:rPr>
+    </w:lvl>
+    <w:lvl w:ilvl="8">
+      <w:numFmt w:val="bullet"/>
+      <w:lvlText w:val=""/>
+      <w:lvlJc w:val="left"/>
+      <w:pPr>
+        <w:ind w:left="6480" w:hanging="360"/>
+      </w:pPr>
+      <w:rPr>
+        <w:rFonts w:ascii="Wingdings" w:hAnsi="Wingdings" w:cs="Wingdings" w:hint="default"/>
+      </w:rPr>
+    </w:lvl>
+  </w:abstractNum>
   <w:num w:numId="1000">
     <w:abstractNumId w:val="990"/>
+  </w:num>
+  <w:num w:numId="1001">
+    <w:abstractNumId w:val="991"/>
   </w:num>
 </w:numbering>
 </file>

</xml_diff>